<commit_message>
feat: added labs 8-9
</commit_message>
<xml_diff>
--- a/lab8/Отчёт Lab 8 Чашин ЕТ-128.docx
+++ b/lab8/Отчёт Lab 8 Чашин ЕТ-128.docx
@@ -650,7 +650,6 @@
                 <w14:ligatures w14:val="none"/>
               </w:rPr>
             </w:pPr>
-            <w:proofErr w:type="spellStart"/>
             <w:r>
               <w:rPr>
                 <w:rFonts w:eastAsia="Times New Roman" w:cs="Times New Roman"/>
@@ -659,18 +658,7 @@
                 <w:lang w:bidi="hi-IN"/>
                 <w14:ligatures w14:val="none"/>
               </w:rPr>
-              <w:t>Юртин</w:t>
-            </w:r>
-            <w:proofErr w:type="spellEnd"/>
-            <w:r>
-              <w:rPr>
-                <w:rFonts w:eastAsia="Times New Roman" w:cs="Times New Roman"/>
-                <w:kern w:val="0"/>
-                <w:szCs w:val="28"/>
-                <w:lang w:bidi="hi-IN"/>
-                <w14:ligatures w14:val="none"/>
-              </w:rPr>
-              <w:t xml:space="preserve"> А.А.</w:t>
+              <w:t>Юртин А.А.</w:t>
             </w:r>
           </w:p>
           <w:p>
@@ -1013,14 +1001,7 @@
       </w:r>
       <w:r>
         <w:noBreakHyphen/>
-      </w:r>
-      <w:proofErr w:type="spellStart"/>
-      <w:r>
-        <w:t>Means</w:t>
-      </w:r>
-      <w:proofErr w:type="spellEnd"/>
-      <w:r>
-        <w:t xml:space="preserve"> (предполагается, что полученные кластеры будут выпуклыми), используя различные значения параметра  (из интервала 3..9). Выполните визуализацию полученных результатов в виде точечных графиков, на которых цвет точки отражает принадлежность кластеру.</w:t>
+        <w:t>Means (предполагается, что полученные кластеры будут выпуклыми), используя различные значения параметра  (из интервала 3..9). Выполните визуализацию полученных результатов в виде точечных графиков, на которых цвет точки отражает принадлежность кластеру.</w:t>
       </w:r>
     </w:p>
     <w:p>
@@ -1041,25 +1022,11 @@
       </w:r>
       <w:r>
         <w:noBreakHyphen/>
-      </w:r>
-      <w:proofErr w:type="spellStart"/>
-      <w:r>
-        <w:t>Means</w:t>
-      </w:r>
-      <w:proofErr w:type="spellEnd"/>
-      <w:r>
-        <w:t xml:space="preserve"> и k</w:t>
+        <w:t>Means и k</w:t>
       </w:r>
       <w:r>
         <w:noBreakHyphen/>
-      </w:r>
-      <w:proofErr w:type="spellStart"/>
-      <w:r>
-        <w:t>Medoids</w:t>
-      </w:r>
-      <w:proofErr w:type="spellEnd"/>
-      <w:r>
-        <w:t xml:space="preserve"> (или PAM), используя различные значения параметра  (из интервала 3..9). Выполните визуализацию полученных результатов в виде точечных графиков, на которых цвет точки отражает принадлежность кластеру.</w:t>
+        <w:t>Medoids (или PAM), используя различные значения параметра  (из интервала 3..9). Выполните визуализацию полученных результатов в виде точечных графиков, на которых цвет точки отражает принадлежность кластеру.</w:t>
       </w:r>
     </w:p>
     <w:p>
@@ -1091,25 +1058,11 @@
       </w:r>
       <w:r>
         <w:noBreakHyphen/>
-      </w:r>
-      <w:proofErr w:type="spellStart"/>
-      <w:r>
-        <w:t>Means</w:t>
-      </w:r>
-      <w:proofErr w:type="spellEnd"/>
-      <w:r>
-        <w:t xml:space="preserve"> и k</w:t>
+        <w:t>Means и k</w:t>
       </w:r>
       <w:r>
         <w:noBreakHyphen/>
-      </w:r>
-      <w:proofErr w:type="spellStart"/>
-      <w:r>
-        <w:t>Medoids</w:t>
-      </w:r>
-      <w:proofErr w:type="spellEnd"/>
-      <w:r>
-        <w:t xml:space="preserve"> (или PAM), используя различные значения параметра  (из интервала 3..9). Выполните визуализацию полученных результатов в виде точечных графиков, на которых цвет точки отражает принадлежность кластеру.</w:t>
+        <w:t>Medoids (или PAM), используя различные значения параметра  (из интервала 3..9). Выполните визуализацию полученных результатов в виде точечных графиков, на которых цвет точки отражает принадлежность кластеру.</w:t>
       </w:r>
     </w:p>
     <w:p>
@@ -1257,6 +1210,9 @@
         <w:jc w:val="center"/>
       </w:pPr>
       <w:r>
+        <w:rPr>
+          <w:noProof/>
+        </w:rPr>
         <w:drawing>
           <wp:inline distT="0" distB="0" distL="0" distR="0" wp14:anchorId="61DDCB49" wp14:editId="40F5E621">
             <wp:extent cx="5940425" cy="4133850"/>
@@ -1330,12 +1286,8 @@
       </w:r>
       <w:r>
         <w:noBreakHyphen/>
-      </w:r>
-      <w:proofErr w:type="spellStart"/>
-      <w:r>
         <w:t>Means</w:t>
       </w:r>
-      <w:proofErr w:type="spellEnd"/>
       <w:r>
         <w:t xml:space="preserve"> с различными значениями параметра </w:t>
       </w:r>
@@ -1362,6 +1314,9 @@
         <w:jc w:val="center"/>
       </w:pPr>
       <w:r>
+        <w:rPr>
+          <w:noProof/>
+        </w:rPr>
         <w:lastRenderedPageBreak/>
         <w:drawing>
           <wp:inline distT="0" distB="0" distL="0" distR="0" wp14:anchorId="3DE9AE9F" wp14:editId="5FB6BCE8">
@@ -1489,10 +1444,7 @@
         <w:t xml:space="preserve"> </w:t>
       </w:r>
       <w:r>
-        <w:t xml:space="preserve">равном </w:t>
-      </w:r>
-      <w:r>
-        <w:t>5</w:t>
+        <w:t>равном 5</w:t>
       </w:r>
       <w:r>
         <w:t xml:space="preserve">. При </w:t>
@@ -1563,7 +1515,19 @@
         <w:rPr>
           <w:lang w:val="en-US"/>
         </w:rPr>
-        <w:t>Metoids</w:t>
+        <w:t>Me</w:t>
+      </w:r>
+      <w:r>
+        <w:rPr>
+          <w:lang w:val="en-US"/>
+        </w:rPr>
+        <w:t>d</w:t>
+      </w:r>
+      <w:r>
+        <w:rPr>
+          <w:lang w:val="en-US"/>
+        </w:rPr>
+        <w:t>oids</w:t>
       </w:r>
       <w:r>
         <w:t xml:space="preserve"> </w:t>
@@ -1577,6 +1541,9 @@
         <w:jc w:val="center"/>
       </w:pPr>
       <w:r>
+        <w:rPr>
+          <w:noProof/>
+        </w:rPr>
         <w:lastRenderedPageBreak/>
         <w:drawing>
           <wp:inline distT="0" distB="0" distL="0" distR="0" wp14:anchorId="6AE86B4B" wp14:editId="748BD51D">
@@ -1660,14 +1627,12 @@
       <w:r>
         <w:t>-</w:t>
       </w:r>
-      <w:proofErr w:type="spellStart"/>
       <w:r>
         <w:rPr>
           <w:lang w:val="en-US"/>
         </w:rPr>
         <w:t>Metiods</w:t>
       </w:r>
-      <w:proofErr w:type="spellEnd"/>
       <w:r>
         <w:t xml:space="preserve"> </w:t>
       </w:r>
@@ -1715,10 +1680,7 @@
         <w:t>means</w:t>
       </w:r>
       <w:r>
-        <w:t xml:space="preserve"> </w:t>
-      </w:r>
-      <w:r>
-        <w:t xml:space="preserve">центр кластера вычисляется как среднее арифметическое </w:t>
+        <w:t xml:space="preserve"> центр кластера вычисляется как среднее арифметическое </w:t>
       </w:r>
       <w:r>
         <w:lastRenderedPageBreak/>
@@ -1736,19 +1698,14 @@
       <w:r>
         <w:t>-</w:t>
       </w:r>
-      <w:proofErr w:type="spellStart"/>
       <w:r>
         <w:rPr>
           <w:lang w:val="en-US"/>
         </w:rPr>
         <w:t>Metiods</w:t>
       </w:r>
-      <w:proofErr w:type="spellEnd"/>
-      <w:r>
-        <w:t xml:space="preserve"> </w:t>
-      </w:r>
-      <w:r>
-        <w:t xml:space="preserve">в качестве центра кластера </w:t>
+      <w:r>
+        <w:t xml:space="preserve"> в качестве центра кластера </w:t>
       </w:r>
       <w:r>
         <w:t>берется</w:t>
@@ -1790,6 +1747,9 @@
         <w:jc w:val="center"/>
       </w:pPr>
       <w:r>
+        <w:rPr>
+          <w:noProof/>
+        </w:rPr>
         <w:drawing>
           <wp:inline distT="0" distB="0" distL="0" distR="0" wp14:anchorId="6C9DB312" wp14:editId="0A0103CF">
             <wp:extent cx="5940425" cy="4091940"/>
@@ -1897,7 +1857,19 @@
         <w:rPr>
           <w:lang w:val="en-US"/>
         </w:rPr>
-        <w:t>Metoids</w:t>
+        <w:t>Me</w:t>
+      </w:r>
+      <w:r>
+        <w:rPr>
+          <w:lang w:val="en-US"/>
+        </w:rPr>
+        <w:t>d</w:t>
+      </w:r>
+      <w:r>
+        <w:rPr>
+          <w:lang w:val="en-US"/>
+        </w:rPr>
+        <w:t>oids</w:t>
       </w:r>
       <w:r>
         <w:t xml:space="preserve"> (</w:t>
@@ -1924,6 +1896,9 @@
         <w:jc w:val="center"/>
       </w:pPr>
       <w:r>
+        <w:rPr>
+          <w:noProof/>
+        </w:rPr>
         <w:lastRenderedPageBreak/>
         <w:drawing>
           <wp:inline distT="0" distB="0" distL="0" distR="0" wp14:anchorId="6FBFABCE" wp14:editId="53ECAFE8">
@@ -2003,10 +1978,13 @@
         <w:jc w:val="center"/>
       </w:pPr>
       <w:r>
+        <w:rPr>
+          <w:noProof/>
+        </w:rPr>
         <w:drawing>
-          <wp:inline distT="0" distB="0" distL="0" distR="0" wp14:anchorId="3D2DDACA" wp14:editId="48D029C6">
-            <wp:extent cx="5940425" cy="4078605"/>
-            <wp:effectExtent l="19050" t="19050" r="22225" b="17145"/>
+          <wp:inline distT="0" distB="0" distL="0" distR="0" wp14:anchorId="3D2DDACA" wp14:editId="6584AF32">
+            <wp:extent cx="5459730" cy="3748567"/>
+            <wp:effectExtent l="19050" t="19050" r="26670" b="23495"/>
             <wp:docPr id="884753684" name="Рисунок 1"/>
             <wp:cNvGraphicFramePr>
               <a:graphicFrameLocks xmlns:a="http://schemas.openxmlformats.org/drawingml/2006/main" noChangeAspect="1"/>
@@ -2027,7 +2005,7 @@
                   <pic:spPr>
                     <a:xfrm>
                       <a:off x="0" y="0"/>
-                      <a:ext cx="5940425" cy="4078605"/>
+                      <a:ext cx="5474058" cy="3758404"/>
                     </a:xfrm>
                     <a:prstGeom prst="rect">
                       <a:avLst/>
@@ -2051,27 +2029,36 @@
     <w:p>
       <w:pPr>
         <w:jc w:val="center"/>
+      </w:pPr>
+      <w:r>
+        <w:t xml:space="preserve">Рисунок 6 – График результатов кластеризации данных алгоритмом </w:t>
+      </w:r>
+      <w:r>
         <w:rPr>
           <w:lang w:val="en-US"/>
         </w:rPr>
-      </w:pPr>
-      <w:r>
-        <w:t xml:space="preserve">Рисунок 6 – График результатов кластеризации данных алгоритмом </w:t>
+        <w:t>k</w:t>
+      </w:r>
+      <w:r>
+        <w:t>-</w:t>
       </w:r>
       <w:r>
         <w:rPr>
           <w:lang w:val="en-US"/>
         </w:rPr>
-        <w:t>k</w:t>
-      </w:r>
-      <w:r>
-        <w:t>-</w:t>
+        <w:t>Me</w:t>
       </w:r>
       <w:r>
         <w:rPr>
           <w:lang w:val="en-US"/>
         </w:rPr>
-        <w:t>Metoids</w:t>
+        <w:t>d</w:t>
+      </w:r>
+      <w:r>
+        <w:rPr>
+          <w:lang w:val="en-US"/>
+        </w:rPr>
+        <w:t>oids</w:t>
       </w:r>
     </w:p>
     <w:p>
@@ -2083,23 +2070,7 @@
         <w:t xml:space="preserve">На графиках видно, </w:t>
       </w:r>
       <w:r>
-        <w:t>что алгоритмы k-</w:t>
-      </w:r>
-      <w:proofErr w:type="spellStart"/>
-      <w:r>
-        <w:t>Means</w:t>
-      </w:r>
-      <w:proofErr w:type="spellEnd"/>
-      <w:r>
-        <w:t xml:space="preserve"> и k-</w:t>
-      </w:r>
-      <w:proofErr w:type="spellStart"/>
-      <w:r>
-        <w:t>Medoids</w:t>
-      </w:r>
-      <w:proofErr w:type="spellEnd"/>
-      <w:r>
-        <w:t xml:space="preserve"> плохо подходят для кластеризации невыпуклых данных, так как они ориентированы на компактные кластеры и не учитывают сложную геометрию распределения точек</w:t>
+        <w:t>что алгоритмы k-Means и k-Medoids плохо подходят для кластеризации невыпуклых данных, так как они ориентированы на компактные кластеры и не учитывают сложную геометрию распределения точек</w:t>
       </w:r>
       <w:r>
         <w:t xml:space="preserve">. </w:t>
@@ -3782,6 +3753,7 @@
   <w:style w:type="character" w:default="1" w:styleId="a0">
     <w:name w:val="Default Paragraph Font"/>
     <w:uiPriority w:val="1"/>
+    <w:semiHidden/>
     <w:unhideWhenUsed/>
   </w:style>
   <w:style w:type="table" w:default="1" w:styleId="a1">

</xml_diff>